<commit_message>
docs: enrich MPI DOKUMENTASI_SUMBER_ASET_DAN_PROMPT_AI.docx with all 13 SVG hardware blueprints, installed states, and hero artworks
</commit_message>
<xml_diff>
--- a/lab/lab-maya/perakitan-komputer/SIAP KIRIM/DOKUMENTASI_SUMBER_ASET_DAN_PROMPT_AI.docx
+++ b/lab/lab-maya/perakitan-komputer/SIAP KIRIM/DOKUMENTASI_SUMBER_ASET_DAN_PROMPT_AI.docx
@@ -5226,79 +5226,7 @@
           <w:sz w:val="19"/>
         </w:rPr>
         <w:br/>
-        <w:t xml:space="preserve">4. Media Lab Maya ini orisinal, belum pernah diikutsertakan dalam perlombaan serupa, dan bebas dari </w:t>
-      </w:r>
-      <w:proofErr w:type="spellStart"/>
-      <w:r>
-        <w:rPr>
-          <w:rFonts w:ascii="Arial" w:hAnsi="Arial"/>
-          <w:color w:val="1E293B"/>
-          <w:sz w:val="19"/>
-        </w:rPr>
-        <w:t>muatan</w:t>
-      </w:r>
-      <w:proofErr w:type="spellEnd"/>
-      <w:r>
-        <w:rPr>
-          <w:rFonts w:ascii="Arial" w:hAnsi="Arial"/>
-          <w:color w:val="1E293B"/>
-          <w:sz w:val="19"/>
-        </w:rPr>
-        <w:t xml:space="preserve"> </w:t>
-      </w:r>
-      <w:proofErr w:type="spellStart"/>
-      <w:r>
-        <w:rPr>
-          <w:rFonts w:ascii="Arial" w:hAnsi="Arial"/>
-          <w:color w:val="1E293B"/>
-          <w:sz w:val="19"/>
-        </w:rPr>
-        <w:t>komersial</w:t>
-      </w:r>
-      <w:proofErr w:type="spellEnd"/>
-      <w:r>
-        <w:rPr>
-          <w:rFonts w:ascii="Arial" w:hAnsi="Arial"/>
-          <w:color w:val="1E293B"/>
-          <w:sz w:val="19"/>
-        </w:rPr>
-        <w:t xml:space="preserve"> </w:t>
-      </w:r>
-      <w:proofErr w:type="spellStart"/>
-      <w:r>
-        <w:rPr>
-          <w:rFonts w:ascii="Arial" w:hAnsi="Arial"/>
-          <w:color w:val="1E293B"/>
-          <w:sz w:val="19"/>
-        </w:rPr>
-        <w:t>maupun</w:t>
-      </w:r>
-      <w:proofErr w:type="spellEnd"/>
-      <w:r>
-        <w:rPr>
-          <w:rFonts w:ascii="Arial" w:hAnsi="Arial"/>
-          <w:color w:val="1E293B"/>
-          <w:sz w:val="19"/>
-        </w:rPr>
-        <w:t xml:space="preserve"> </w:t>
-      </w:r>
-      <w:proofErr w:type="spellStart"/>
-      <w:r>
-        <w:rPr>
-          <w:rFonts w:ascii="Arial" w:hAnsi="Arial"/>
-          <w:color w:val="1E293B"/>
-          <w:sz w:val="19"/>
-        </w:rPr>
-        <w:t>plagiarisme</w:t>
-      </w:r>
-      <w:proofErr w:type="spellEnd"/>
-      <w:r>
-        <w:rPr>
-          <w:rFonts w:ascii="Arial" w:hAnsi="Arial"/>
-          <w:color w:val="1E293B"/>
-          <w:sz w:val="19"/>
-        </w:rPr>
-        <w:t>.</w:t>
+        <w:t>4. Media Lab Maya ini orisinal, belum pernah diikutsertakan dalam perlombaan serupa, dan bebas dari muatan komersial maupun plagiarisme.</w:t>
       </w:r>
     </w:p>
     <w:p>
@@ -5385,31 +5313,20 @@
           </wp:anchor>
         </w:drawing>
       </w:r>
-      <w:proofErr w:type="spellStart"/>
       <w:r>
         <w:rPr>
           <w:rFonts w:ascii="Arial" w:hAnsi="Arial"/>
           <w:sz w:val="19"/>
         </w:rPr>
-        <w:t>Lamongan</w:t>
+        <w:t xml:space="preserve">Lamongan, </w:t>
       </w:r>
-      <w:proofErr w:type="spellEnd"/>
       <w:r>
         <w:rPr>
           <w:rFonts w:ascii="Arial" w:hAnsi="Arial"/>
           <w:sz w:val="19"/>
         </w:rPr>
-        <w:t xml:space="preserve">, </w:t>
+        <w:t>25 September</w:t>
       </w:r>
-      <w:proofErr w:type="spellStart"/>
-      <w:r>
-        <w:rPr>
-          <w:rFonts w:ascii="Arial" w:hAnsi="Arial"/>
-          <w:sz w:val="19"/>
-        </w:rPr>
-        <w:t>Februari</w:t>
-      </w:r>
-      <w:proofErr w:type="spellEnd"/>
       <w:r>
         <w:rPr>
           <w:rFonts w:ascii="Arial" w:hAnsi="Arial"/>
@@ -5423,22 +5340,7 @@
           <w:sz w:val="19"/>
         </w:rPr>
         <w:br/>
-      </w:r>
-      <w:proofErr w:type="spellStart"/>
-      <w:r>
-        <w:rPr>
-          <w:rFonts w:ascii="Arial" w:hAnsi="Arial"/>
-          <w:sz w:val="19"/>
-        </w:rPr>
-        <w:t>Pengembang</w:t>
-      </w:r>
-      <w:proofErr w:type="spellEnd"/>
-      <w:r>
-        <w:rPr>
-          <w:rFonts w:ascii="Arial" w:hAnsi="Arial"/>
-          <w:sz w:val="19"/>
-        </w:rPr>
-        <w:t xml:space="preserve"> Karya,</w:t>
+        <w:t>Pengembang Karya,</w:t>
       </w:r>
       <w:r>
         <w:rPr>

</xml_diff>